<commit_message>
Generate DPA PDF from the page via `bun run legal`
The published /dpa/ page is the single source of truth. Fold DPA PDF
generation (pandoc + headless Chrome) into the existing legal-docs script
so the download regenerates from web with no dependency on docs/. Also
refresh the Privacy/Security download mirrors to pick up the new DPA links.

Co-Authored-By: Claude Opus 4.8 (1M context) <noreply@anthropic.com>
</commit_message>
<xml_diff>
--- a/public/legal/RevenueHunt-Information-Security-Policy.docx
+++ b/public/legal/RevenueHunt-Information-Security-Policy.docx
@@ -2,7 +2,7 @@
 <file path=word/document.xml><?xml version="1.0" encoding="utf-8"?>
 <w:document xmlns:w="http://schemas.openxmlformats.org/wordprocessingml/2006/main" xmlns:m="http://schemas.openxmlformats.org/officeDocument/2006/math" xmlns:r="http://schemas.openxmlformats.org/officeDocument/2006/relationships" xmlns:o="urn:schemas-microsoft-com:office:office" xmlns:v="urn:schemas-microsoft-com:vml" xmlns:w10="urn:schemas-microsoft-com:office:word" xmlns:a="http://schemas.openxmlformats.org/drawingml/2006/main" xmlns:pic="http://schemas.openxmlformats.org/drawingml/2006/picture" xmlns:wp="http://schemas.openxmlformats.org/drawingml/2006/wordprocessingDrawing">
   <w:body>
-    <w:bookmarkStart w:id="33" w:name="revenuehunt-information-security-policy"/>
+    <w:bookmarkStart w:id="34" w:name="revenuehunt-information-security-policy"/>
     <w:p>
       <w:pPr>
         <w:pStyle w:val="Heading1"/>
@@ -963,7 +963,7 @@
     </w:p>
     <w:bookmarkEnd w:id="28"/>
     <w:bookmarkEnd w:id="29"/>
-    <w:bookmarkStart w:id="31" w:name="privacy-and-compliance"/>
+    <w:bookmarkStart w:id="32" w:name="privacy-and-compliance"/>
     <w:p>
       <w:pPr>
         <w:pStyle w:val="Heading2"/>
@@ -991,11 +991,28 @@
         </w:r>
       </w:hyperlink>
       <w:r>
-        <w:t xml:space="preserve">, which includes our positions on GDPR, CCPA, CPRA, VCDPA, and Shopify’s Protected Customer Data programme. A signed Data Processing Agreement is available on request to merchants who require one.</w:t>
-      </w:r>
-    </w:p>
-    <w:bookmarkEnd w:id="31"/>
-    <w:bookmarkStart w:id="32" w:name="questions"/>
+        <w:t xml:space="preserve">, which includes our positions on GDPR, CCPA, CPRA, VCDPA, and Shopify’s Protected Customer Data programme. Our</w:t>
+      </w:r>
+      <w:r>
+        <w:t xml:space="preserve"> </w:t>
+      </w:r>
+      <w:hyperlink r:id="rId31">
+        <w:r>
+          <w:rPr>
+            <w:rStyle w:val="Hyperlink"/>
+          </w:rPr>
+          <w:t xml:space="preserve">Data Processing Agreement</w:t>
+        </w:r>
+      </w:hyperlink>
+      <w:r>
+        <w:t xml:space="preserve"> </w:t>
+      </w:r>
+      <w:r>
+        <w:t xml:space="preserve">is published in full, and a signed copy is available on request to merchants who require one.</w:t>
+      </w:r>
+    </w:p>
+    <w:bookmarkEnd w:id="32"/>
+    <w:bookmarkStart w:id="33" w:name="questions"/>
     <w:p>
       <w:pPr>
         <w:pStyle w:val="Heading2"/>
@@ -1009,7 +1026,7 @@
         <w:pStyle w:val="FirstParagraph"/>
       </w:pPr>
       <w:r>
-        <w:t xml:space="preserve">For security questions that are not vulnerability reports — for example, requests for our security questionnaire, DPA, or SOC documentation — please email</w:t>
+        <w:t xml:space="preserve">For security questions that are not vulnerability reports - for example, requests for our security questionnaire, DPA, or SOC documentation - please email</w:t>
       </w:r>
       <w:r>
         <w:t xml:space="preserve"> </w:t>
@@ -1041,8 +1058,8 @@
         <w:t xml:space="preserve">in the subject line.</w:t>
       </w:r>
     </w:p>
-    <w:bookmarkEnd w:id="32"/>
     <w:bookmarkEnd w:id="33"/>
+    <w:bookmarkEnd w:id="34"/>
     <w:sectPr>
       <w:footnotePr>
         <w:numRestart w:val="eachSect"/>

</xml_diff>

<commit_message>
legal: change operating entity to Durian Capital Inc.
The legal pages named Dairy Capital Limited (England and Wales,
company no. 12503996). The entity that owns and operates
revenuehunt.com is Durian Capital Inc., a BVI business company
(no. 2109760, Intershore Chambers, Road Town, Tortola), per its
Certificate of Incorporation and Certificate of Incumbency.

Update tos, privacy, dpa and security to the correct entity,
number and registered office, and state explicitly in the ToS and
Privacy pages that Durian Capital Inc. owns and operates the
revenuehunt.com domain.

The entity was also embedded in the five downloadable legal files
in public/legal (2 CSV, 2 DOCX, 1 PDF); regenerated from the
corrected markdown via `bun run legal`.

Co-Authored-By: Claude Opus 4.8 (1M context) <noreply@anthropic.com>
</commit_message>
<xml_diff>
--- a/public/legal/RevenueHunt-Information-Security-Policy.docx
+++ b/public/legal/RevenueHunt-Information-Security-Policy.docx
@@ -16,7 +16,7 @@
         <w:pStyle w:val="FirstParagraph"/>
       </w:pPr>
       <w:r>
-        <w:t xml:space="preserve">Last updated: May 19, 2026.</w:t>
+        <w:t xml:space="preserve">Last updated: July 13, 2026.</w:t>
       </w:r>
     </w:p>
     <w:p>
@@ -82,10 +82,10 @@
           <w:b/>
           <w:bCs/>
         </w:rPr>
-        <w:t xml:space="preserve">Dairy Capital Limited</w:t>
-      </w:r>
-      <w:r>
-        <w:t xml:space="preserve">, a private limited company incorporated in England and Wales (company number 12503996, registered office: Vision Accounting Fortis House, Cothey Way, Ryde, Isle of Wight, PO33 1QT, United Kingdom). We process data on behalf of ecommerce merchants on Shopify, WooCommerce, BigCommerce, and Magento. Their trust depends on our security posture, so we treat it as a first-class engineering concern, not a paperwork exercise.</w:t>
+        <w:t xml:space="preserve">Durian Capital Inc.</w:t>
+      </w:r>
+      <w:r>
+        <w:t xml:space="preserve">, a business company incorporated in the British Virgin Islands (company number 2109760, registered office: Intershore Chambers, Road Town, Tortola, British Virgin Islands). We process data on behalf of ecommerce merchants on Shopify, WooCommerce, BigCommerce, and Magento. Their trust depends on our security posture, so we treat it as a first-class engineering concern, not a paperwork exercise.</w:t>
       </w:r>
     </w:p>
     <w:p>

</xml_diff>